<commit_message>
added one more file
</commit_message>
<xml_diff>
--- a/uday_notes.docx
+++ b/uday_notes.docx
@@ -288,13 +288,8 @@
         </w:numPr>
       </w:pPr>
       <w:r>
-        <w:t>Source tools --Git/</w:t>
-      </w:r>
-      <w:proofErr w:type="spellStart"/>
-      <w:r>
-        <w:t>Github</w:t>
-      </w:r>
-      <w:proofErr w:type="spellEnd"/>
+        <w:t>Source tools --Git/Github</w:t>
+      </w:r>
     </w:p>
     <w:p>
       <w:pPr>
@@ -329,15 +324,7 @@
         </w:numPr>
       </w:pPr>
       <w:r>
-        <w:t>Storage—ACR/</w:t>
-      </w:r>
-      <w:proofErr w:type="spellStart"/>
-      <w:r>
-        <w:t>jfrog</w:t>
-      </w:r>
-      <w:proofErr w:type="spellEnd"/>
-      <w:r>
-        <w:t xml:space="preserve"> </w:t>
+        <w:t xml:space="preserve">Storage—ACR/jfrog </w:t>
       </w:r>
     </w:p>
     <w:p>
@@ -361,15 +348,7 @@
         </w:numPr>
       </w:pPr>
       <w:r>
-        <w:t>Orchestration – Kubernates (</w:t>
-      </w:r>
-      <w:proofErr w:type="spellStart"/>
-      <w:r>
-        <w:t>yaml</w:t>
-      </w:r>
-      <w:proofErr w:type="spellEnd"/>
-      <w:r>
-        <w:t>)</w:t>
+        <w:t>Orchestration – Kubernates (yaml)</w:t>
       </w:r>
     </w:p>
     <w:p>
@@ -421,11 +400,9 @@
           <w:numId w:val="4"/>
         </w:numPr>
       </w:pPr>
-      <w:proofErr w:type="spellStart"/>
       <w:r>
         <w:t>PreProd</w:t>
       </w:r>
-      <w:proofErr w:type="spellEnd"/>
     </w:p>
     <w:p>
       <w:pPr>
@@ -469,38 +446,17 @@
     </w:p>
     <w:p>
       <w:r>
-        <w:t xml:space="preserve"> Source tools: Git/</w:t>
-      </w:r>
-      <w:proofErr w:type="spellStart"/>
-      <w:r>
-        <w:t>Github</w:t>
-      </w:r>
-      <w:proofErr w:type="spellEnd"/>
-    </w:p>
-    <w:p>
-      <w:r>
-        <w:t xml:space="preserve">  CI/</w:t>
-      </w:r>
-      <w:proofErr w:type="gramStart"/>
-      <w:r>
-        <w:t>CD :</w:t>
-      </w:r>
-      <w:proofErr w:type="gramEnd"/>
-      <w:r>
-        <w:t xml:space="preserve"> Azure DevOps/ADO </w:t>
-      </w:r>
-    </w:p>
-    <w:p>
-      <w:r>
-        <w:t xml:space="preserve">   </w:t>
-      </w:r>
-      <w:proofErr w:type="gramStart"/>
-      <w:r>
-        <w:t>IAC :</w:t>
-      </w:r>
-      <w:proofErr w:type="gramEnd"/>
-      <w:r>
-        <w:t xml:space="preserve"> Terraform</w:t>
+        <w:t xml:space="preserve"> Source tools: Git/Github</w:t>
+      </w:r>
+    </w:p>
+    <w:p>
+      <w:r>
+        <w:t xml:space="preserve">  CI/CD : Azure DevOps/ADO </w:t>
+      </w:r>
+    </w:p>
+    <w:p>
+      <w:r>
+        <w:t xml:space="preserve">   IAC : Terraform</w:t>
       </w:r>
     </w:p>
     <w:p>
@@ -558,13 +514,8 @@
           <w:numId w:val="5"/>
         </w:numPr>
       </w:pPr>
-      <w:proofErr w:type="spellStart"/>
-      <w:r>
-        <w:t>Vm</w:t>
-      </w:r>
-      <w:proofErr w:type="spellEnd"/>
-      <w:r>
-        <w:t xml:space="preserve"> -------------1 machine from portal  </w:t>
+      <w:r>
+        <w:t xml:space="preserve">Vm -------------1 machine from portal  </w:t>
       </w:r>
     </w:p>
     <w:p>
@@ -575,12 +526,10 @@
           <w:numId w:val="5"/>
         </w:numPr>
       </w:pPr>
-      <w:proofErr w:type="spellStart"/>
       <w:r>
         <w:lastRenderedPageBreak/>
         <w:t>Vnet</w:t>
       </w:r>
-      <w:proofErr w:type="spellEnd"/>
     </w:p>
     <w:p>
       <w:pPr>
@@ -645,13 +594,8 @@
       </w:r>
       <w:r>
         <w:tab/>
-        <w:t>Source tools --Git/</w:t>
-      </w:r>
-      <w:proofErr w:type="spellStart"/>
-      <w:r>
-        <w:t>Github</w:t>
-      </w:r>
-      <w:proofErr w:type="spellEnd"/>
+        <w:t>Source tools --Git/Github</w:t>
+      </w:r>
     </w:p>
     <w:p>
       <w:r>
@@ -677,15 +621,7 @@
       </w:r>
       <w:r>
         <w:tab/>
-        <w:t>Storage—ACR/</w:t>
-      </w:r>
-      <w:proofErr w:type="spellStart"/>
-      <w:r>
-        <w:t>jfrog</w:t>
-      </w:r>
-      <w:proofErr w:type="spellEnd"/>
-      <w:r>
-        <w:t xml:space="preserve"> </w:t>
+        <w:t xml:space="preserve">Storage—ACR/jfrog </w:t>
       </w:r>
     </w:p>
     <w:p>
@@ -703,15 +639,7 @@
       </w:r>
       <w:r>
         <w:tab/>
-        <w:t>Orchestration – Kubernates (</w:t>
-      </w:r>
-      <w:proofErr w:type="spellStart"/>
-      <w:r>
-        <w:t>yaml</w:t>
-      </w:r>
-      <w:proofErr w:type="spellEnd"/>
-      <w:r>
-        <w:t>)</w:t>
+        <w:t>Orchestration – Kubernates (yaml)</w:t>
       </w:r>
     </w:p>
     <w:p>
@@ -933,21 +861,8 @@
       <w:r>
         <w:t>Ansible -</w:t>
       </w:r>
-      <w:proofErr w:type="spellStart"/>
-      <w:r>
-        <w:t>Vms</w:t>
-      </w:r>
-      <w:proofErr w:type="spellEnd"/>
-      <w:r>
-        <w:t>—</w:t>
-      </w:r>
-      <w:proofErr w:type="spellStart"/>
-      <w:r>
-        <w:t>apache</w:t>
-      </w:r>
-      <w:proofErr w:type="spellEnd"/>
-      <w:r>
-        <w:t xml:space="preserve">, tomcat and java </w:t>
+      <w:r>
+        <w:t xml:space="preserve">Vms—apache, tomcat and java </w:t>
       </w:r>
       <w:r>
         <w:t>–100 servers</w:t>
@@ -989,11 +904,9 @@
           <w:numId w:val="7"/>
         </w:numPr>
       </w:pPr>
-      <w:proofErr w:type="spellStart"/>
       <w:r>
         <w:t>AIops</w:t>
       </w:r>
-      <w:proofErr w:type="spellEnd"/>
     </w:p>
     <w:p>
       <w:pPr>
@@ -1003,11 +916,9 @@
           <w:numId w:val="7"/>
         </w:numPr>
       </w:pPr>
-      <w:proofErr w:type="spellStart"/>
       <w:r>
         <w:t>MLops</w:t>
       </w:r>
-      <w:proofErr w:type="spellEnd"/>
     </w:p>
     <w:p>
       <w:pPr>
@@ -1051,15 +962,7 @@
     </w:p>
     <w:p>
       <w:r>
-        <w:t xml:space="preserve">           </w:t>
-      </w:r>
-      <w:proofErr w:type="spellStart"/>
-      <w:r>
-        <w:t>Infras</w:t>
-      </w:r>
-      <w:proofErr w:type="spellEnd"/>
-      <w:r>
-        <w:t xml:space="preserve"> team</w:t>
+        <w:t xml:space="preserve">           Infras team</w:t>
       </w:r>
     </w:p>
     <w:p>
@@ -1576,13 +1479,8 @@
     </w:p>
     <w:p>
       <w:r>
-        <w:t>Git/</w:t>
-      </w:r>
-      <w:proofErr w:type="spellStart"/>
-      <w:r>
-        <w:t>Github</w:t>
-      </w:r>
-      <w:proofErr w:type="spellEnd"/>
+        <w:t>Git/Github</w:t>
+      </w:r>
     </w:p>
     <w:p>
       <w:r>
@@ -1610,11 +1508,9 @@
       </w:r>
     </w:p>
     <w:p>
-      <w:proofErr w:type="spellStart"/>
       <w:r>
         <w:t>Kubenrates</w:t>
       </w:r>
-      <w:proofErr w:type="spellEnd"/>
     </w:p>
     <w:p>
       <w:r>
@@ -1933,13 +1829,8 @@
     <w:p/>
     <w:p/>
     <w:p>
-      <w:proofErr w:type="spellStart"/>
-      <w:r>
-        <w:t>Benifies</w:t>
-      </w:r>
-      <w:proofErr w:type="spellEnd"/>
-      <w:r>
-        <w:t>:</w:t>
+      <w:r>
+        <w:t>Benifies:</w:t>
       </w:r>
     </w:p>
     <w:p>
@@ -1995,15 +1886,7 @@
         <w:t>Development</w:t>
       </w:r>
       <w:r>
-        <w:t xml:space="preserve"> –from scratch to development/ or </w:t>
-      </w:r>
-      <w:proofErr w:type="spellStart"/>
-      <w:r>
-        <w:t>midle</w:t>
-      </w:r>
-      <w:proofErr w:type="spellEnd"/>
-      <w:r>
-        <w:t xml:space="preserve"> development </w:t>
+        <w:t xml:space="preserve"> –from scratch to development/ or midle development </w:t>
       </w:r>
     </w:p>
     <w:p>
@@ -2014,13 +1897,8 @@
           <w:numId w:val="16"/>
         </w:numPr>
       </w:pPr>
-      <w:proofErr w:type="spellStart"/>
-      <w:r>
-        <w:t>Maintainance</w:t>
-      </w:r>
-      <w:proofErr w:type="spellEnd"/>
-      <w:r>
-        <w:t xml:space="preserve"> – any features implementation </w:t>
+      <w:r>
+        <w:t xml:space="preserve">Maintainance – any features implementation </w:t>
       </w:r>
     </w:p>
     <w:p>
@@ -2046,34 +1924,11 @@
           <w:numId w:val="16"/>
         </w:numPr>
       </w:pPr>
-      <w:proofErr w:type="gramStart"/>
       <w:r>
         <w:t xml:space="preserve">Migration </w:t>
       </w:r>
       <w:r>
-        <w:t xml:space="preserve"> ----</w:t>
-      </w:r>
-      <w:proofErr w:type="gramEnd"/>
-      <w:r>
-        <w:t xml:space="preserve"> </w:t>
-      </w:r>
-      <w:proofErr w:type="spellStart"/>
-      <w:proofErr w:type="gramStart"/>
-      <w:r>
-        <w:t>gitlab,github</w:t>
-      </w:r>
-      <w:proofErr w:type="spellEnd"/>
-      <w:proofErr w:type="gramEnd"/>
-      <w:r>
-        <w:t>, ---</w:t>
-      </w:r>
-      <w:proofErr w:type="spellStart"/>
-      <w:r>
-        <w:t>github</w:t>
-      </w:r>
-      <w:proofErr w:type="spellEnd"/>
-      <w:r>
-        <w:t xml:space="preserve"> action </w:t>
+        <w:t xml:space="preserve"> ---- gitlab,github, ---github action </w:t>
       </w:r>
     </w:p>
     <w:p/>
@@ -2277,13 +2132,8 @@
           </w:tcPr>
           <w:p>
             <w:r>
-              <w:t xml:space="preserve">Maven, Gradle, </w:t>
+              <w:t>Maven, Gradle, MSBuild</w:t>
             </w:r>
-            <w:proofErr w:type="spellStart"/>
-            <w:r>
-              <w:t>MSBuild</w:t>
-            </w:r>
-            <w:proofErr w:type="spellEnd"/>
           </w:p>
         </w:tc>
       </w:tr>
@@ -2311,15 +2161,7 @@
           </w:tcPr>
           <w:p>
             <w:r>
-              <w:t xml:space="preserve">Azure Artifacts, Nexus, </w:t>
-            </w:r>
-            <w:proofErr w:type="spellStart"/>
-            <w:r>
-              <w:t>JFrog</w:t>
-            </w:r>
-            <w:proofErr w:type="spellEnd"/>
-            <w:r>
-              <w:t xml:space="preserve"> Artifactory</w:t>
+              <w:t>Azure Artifacts, Nexus, JFrog Artifactory</w:t>
             </w:r>
           </w:p>
         </w:tc>
@@ -2493,13 +2335,8 @@
           </w:tcPr>
           <w:p>
             <w:r>
-              <w:t xml:space="preserve">SonarQube, </w:t>
+              <w:t>SonarQube, Trivy</w:t>
             </w:r>
-            <w:proofErr w:type="spellStart"/>
-            <w:r>
-              <w:t>Trivy</w:t>
-            </w:r>
-            <w:proofErr w:type="spellEnd"/>
           </w:p>
         </w:tc>
       </w:tr>
@@ -2531,15 +2368,7 @@
     <w:p/>
     <w:p>
       <w:r>
-        <w:t>Git/</w:t>
-      </w:r>
-      <w:proofErr w:type="spellStart"/>
-      <w:r>
-        <w:t>Github</w:t>
-      </w:r>
-      <w:proofErr w:type="spellEnd"/>
-      <w:r>
-        <w:t>:</w:t>
+        <w:t>Git/Github:</w:t>
       </w:r>
     </w:p>
     <w:p/>
@@ -2794,32 +2623,14 @@
       </w:r>
     </w:p>
     <w:p>
-      <w:proofErr w:type="spellStart"/>
-      <w:proofErr w:type="gramStart"/>
       <w:r>
         <w:lastRenderedPageBreak/>
-        <w:t>cmd</w:t>
-      </w:r>
-      <w:proofErr w:type="spellEnd"/>
-      <w:r>
-        <w:t xml:space="preserve"> :</w:t>
-      </w:r>
-      <w:proofErr w:type="gramEnd"/>
-      <w:r>
-        <w:t xml:space="preserve"> git version</w:t>
-      </w:r>
-    </w:p>
-    <w:p>
-      <w:r>
-        <w:t>git version 2.37.</w:t>
-      </w:r>
-      <w:proofErr w:type="gramStart"/>
-      <w:r>
-        <w:t>2.windows</w:t>
-      </w:r>
-      <w:proofErr w:type="gramEnd"/>
-      <w:r>
-        <w:t>.2</w:t>
+        <w:t>cmd : git version</w:t>
+      </w:r>
+    </w:p>
+    <w:p>
+      <w:r>
+        <w:t>git version 2.37.2.windows.2</w:t>
       </w:r>
     </w:p>
     <w:p/>
@@ -2842,13 +2653,8 @@
     </w:p>
     <w:p/>
     <w:p>
-      <w:proofErr w:type="spellStart"/>
-      <w:r>
-        <w:t>Github</w:t>
-      </w:r>
-      <w:proofErr w:type="spellEnd"/>
-      <w:r>
-        <w:t xml:space="preserve"> url: </w:t>
+      <w:r>
+        <w:t xml:space="preserve">Github url: </w:t>
       </w:r>
       <w:hyperlink r:id="rId9" w:history="1">
         <w:r>
@@ -2917,25 +2723,12 @@
     <w:p/>
     <w:p>
       <w:r>
-        <w:t>Git/</w:t>
-      </w:r>
-      <w:proofErr w:type="spellStart"/>
-      <w:r>
-        <w:t>Github</w:t>
-      </w:r>
-      <w:proofErr w:type="spellEnd"/>
-      <w:r>
-        <w:t>:</w:t>
-      </w:r>
-    </w:p>
-    <w:p>
-      <w:proofErr w:type="spellStart"/>
-      <w:r>
-        <w:t>Github</w:t>
-      </w:r>
-      <w:proofErr w:type="spellEnd"/>
-      <w:r>
-        <w:t xml:space="preserve"> url: </w:t>
+        <w:t>Git/Github:</w:t>
+      </w:r>
+    </w:p>
+    <w:p>
+      <w:r>
+        <w:t xml:space="preserve">Github url: </w:t>
       </w:r>
       <w:hyperlink r:id="rId11" w:history="1">
         <w:r>
@@ -2979,15 +2772,7 @@
     </w:p>
     <w:p>
       <w:r>
-        <w:t xml:space="preserve">git branch --which branch we </w:t>
-      </w:r>
-      <w:proofErr w:type="spellStart"/>
-      <w:r>
-        <w:t>curretly</w:t>
-      </w:r>
-      <w:proofErr w:type="spellEnd"/>
-      <w:r>
-        <w:t xml:space="preserve"> showing</w:t>
+        <w:t>git branch --which branch we curretly showing</w:t>
       </w:r>
     </w:p>
     <w:p>
@@ -2997,13 +2782,8 @@
     </w:p>
     <w:p>
       <w:r>
-        <w:t xml:space="preserve">git </w:t>
-      </w:r>
-      <w:proofErr w:type="gramStart"/>
-      <w:r>
-        <w:t>add .</w:t>
-      </w:r>
-      <w:proofErr w:type="gramEnd"/>
+        <w:t>git add .</w:t>
+      </w:r>
     </w:p>
     <w:p>
       <w:r>
@@ -3023,13 +2803,8 @@
     </w:p>
     <w:p>
       <w:r>
-        <w:t xml:space="preserve">git </w:t>
-      </w:r>
-      <w:proofErr w:type="gramStart"/>
-      <w:r>
-        <w:t>pull</w:t>
-      </w:r>
-      <w:proofErr w:type="gramEnd"/>
+        <w:t>git pull</w:t>
+      </w:r>
     </w:p>
     <w:p>
       <w:r>
@@ -3039,13 +2814,8 @@
     <w:p/>
     <w:p>
       <w:r>
-        <w:t xml:space="preserve">git </w:t>
-      </w:r>
-      <w:proofErr w:type="gramStart"/>
-      <w:r>
-        <w:t>add .</w:t>
-      </w:r>
-      <w:proofErr w:type="gramEnd"/>
+        <w:t>git add .</w:t>
+      </w:r>
     </w:p>
     <w:p>
       <w:r>
@@ -3063,6 +2833,163 @@
       </w:r>
     </w:p>
     <w:p/>
+    <w:p>
+      <w:pPr>
+        <w:rPr>
+          <w:u w:val="single"/>
+        </w:rPr>
+      </w:pPr>
+    </w:p>
+    <w:p>
+      <w:pPr>
+        <w:rPr>
+          <w:u w:val="single"/>
+        </w:rPr>
+      </w:pPr>
+    </w:p>
+    <w:p>
+      <w:pPr>
+        <w:rPr>
+          <w:u w:val="single"/>
+        </w:rPr>
+      </w:pPr>
+    </w:p>
+    <w:p>
+      <w:pPr>
+        <w:rPr>
+          <w:u w:val="single"/>
+        </w:rPr>
+      </w:pPr>
+      <w:r>
+        <w:rPr>
+          <w:u w:val="single"/>
+        </w:rPr>
+        <w:lastRenderedPageBreak/>
+        <w:t>31/10/2026:</w:t>
+      </w:r>
+    </w:p>
+    <w:p>
+      <w:pPr>
+        <w:rPr>
+          <w:u w:val="single"/>
+        </w:rPr>
+      </w:pPr>
+    </w:p>
+    <w:p>
+      <w:r>
+        <w:t xml:space="preserve"> Git Architecture:</w:t>
+      </w:r>
+    </w:p>
+    <w:p>
+      <w:r>
+        <w:t>What is Git?</w:t>
+      </w:r>
+    </w:p>
+    <w:p>
+      <w:r>
+        <w:t xml:space="preserve">Git is a distributed version control system </w:t>
+      </w:r>
+    </w:p>
+    <w:p>
+      <w:r>
+        <w:t xml:space="preserve">Every developer has </w:t>
+      </w:r>
+      <w:r>
+        <w:t xml:space="preserve">a </w:t>
+      </w:r>
+      <w:r>
+        <w:t>complete copy of the repository</w:t>
+      </w:r>
+    </w:p>
+    <w:p/>
+    <w:p>
+      <w:r>
+        <w:rPr>
+          <w:noProof/>
+        </w:rPr>
+        <w:drawing>
+          <wp:inline distT="0" distB="0" distL="0" distR="0" wp14:anchorId="62EC83B0" wp14:editId="78C677B1">
+            <wp:extent cx="3867150" cy="3527122"/>
+            <wp:effectExtent l="0" t="0" r="0" b="0"/>
+            <wp:docPr id="741282122" name="Picture 1"/>
+            <wp:cNvGraphicFramePr>
+              <a:graphicFrameLocks xmlns:a="http://schemas.openxmlformats.org/drawingml/2006/main" noChangeAspect="1"/>
+            </wp:cNvGraphicFramePr>
+            <a:graphic xmlns:a="http://schemas.openxmlformats.org/drawingml/2006/main">
+              <a:graphicData uri="http://schemas.openxmlformats.org/drawingml/2006/picture">
+                <pic:pic xmlns:pic="http://schemas.openxmlformats.org/drawingml/2006/picture">
+                  <pic:nvPicPr>
+                    <pic:cNvPr id="741282122" name=""/>
+                    <pic:cNvPicPr/>
+                  </pic:nvPicPr>
+                  <pic:blipFill>
+                    <a:blip r:embed="rId12"/>
+                    <a:stretch>
+                      <a:fillRect/>
+                    </a:stretch>
+                  </pic:blipFill>
+                  <pic:spPr>
+                    <a:xfrm>
+                      <a:off x="0" y="0"/>
+                      <a:ext cx="3870419" cy="3530103"/>
+                    </a:xfrm>
+                    <a:prstGeom prst="rect">
+                      <a:avLst/>
+                    </a:prstGeom>
+                  </pic:spPr>
+                </pic:pic>
+              </a:graphicData>
+            </a:graphic>
+          </wp:inline>
+        </w:drawing>
+      </w:r>
+    </w:p>
+    <w:p/>
+    <w:p/>
+    <w:p>
+      <w:r>
+        <w:t>Repository</w:t>
+      </w:r>
+    </w:p>
+    <w:p>
+      <w:pPr>
+        <w:pStyle w:val="ListParagraph"/>
+        <w:numPr>
+          <w:ilvl w:val="0"/>
+          <w:numId w:val="20"/>
+        </w:numPr>
+      </w:pPr>
+      <w:r>
+        <w:t>Local Repository</w:t>
+      </w:r>
+    </w:p>
+    <w:p>
+      <w:pPr>
+        <w:pStyle w:val="ListParagraph"/>
+        <w:numPr>
+          <w:ilvl w:val="0"/>
+          <w:numId w:val="20"/>
+        </w:numPr>
+      </w:pPr>
+      <w:r>
+        <w:t xml:space="preserve">Remote repository </w:t>
+      </w:r>
+    </w:p>
+    <w:p/>
+    <w:p>
+      <w:pPr>
+        <w:rPr>
+          <w:u w:val="single"/>
+        </w:rPr>
+      </w:pPr>
+    </w:p>
+    <w:p>
+      <w:pPr>
+        <w:rPr>
+          <w:u w:val="single"/>
+        </w:rPr>
+      </w:pPr>
+    </w:p>
     <w:p/>
     <w:sectPr>
       <w:pgSz w:w="12240" w:h="15840"/>
@@ -3653,6 +3580,92 @@
     </w:lvl>
   </w:abstractNum>
   <w:abstractNum w:abstractNumId="6" w15:restartNumberingAfterBreak="0">
+    <w:nsid w:val="335B6D30"/>
+    <w:multiLevelType w:val="hybridMultilevel"/>
+    <w:tmpl w:val="4C363CD8"/>
+    <w:lvl w:ilvl="0" w:tplc="0409000F">
+      <w:start w:val="1"/>
+      <w:numFmt w:val="decimal"/>
+      <w:lvlText w:val="%1."/>
+      <w:lvlJc w:val="left"/>
+      <w:pPr>
+        <w:ind w:left="720" w:hanging="360"/>
+      </w:pPr>
+    </w:lvl>
+    <w:lvl w:ilvl="1" w:tplc="04090019" w:tentative="1">
+      <w:start w:val="1"/>
+      <w:numFmt w:val="lowerLetter"/>
+      <w:lvlText w:val="%2."/>
+      <w:lvlJc w:val="left"/>
+      <w:pPr>
+        <w:ind w:left="1440" w:hanging="360"/>
+      </w:pPr>
+    </w:lvl>
+    <w:lvl w:ilvl="2" w:tplc="0409001B" w:tentative="1">
+      <w:start w:val="1"/>
+      <w:numFmt w:val="lowerRoman"/>
+      <w:lvlText w:val="%3."/>
+      <w:lvlJc w:val="right"/>
+      <w:pPr>
+        <w:ind w:left="2160" w:hanging="180"/>
+      </w:pPr>
+    </w:lvl>
+    <w:lvl w:ilvl="3" w:tplc="0409000F" w:tentative="1">
+      <w:start w:val="1"/>
+      <w:numFmt w:val="decimal"/>
+      <w:lvlText w:val="%4."/>
+      <w:lvlJc w:val="left"/>
+      <w:pPr>
+        <w:ind w:left="2880" w:hanging="360"/>
+      </w:pPr>
+    </w:lvl>
+    <w:lvl w:ilvl="4" w:tplc="04090019" w:tentative="1">
+      <w:start w:val="1"/>
+      <w:numFmt w:val="lowerLetter"/>
+      <w:lvlText w:val="%5."/>
+      <w:lvlJc w:val="left"/>
+      <w:pPr>
+        <w:ind w:left="3600" w:hanging="360"/>
+      </w:pPr>
+    </w:lvl>
+    <w:lvl w:ilvl="5" w:tplc="0409001B" w:tentative="1">
+      <w:start w:val="1"/>
+      <w:numFmt w:val="lowerRoman"/>
+      <w:lvlText w:val="%6."/>
+      <w:lvlJc w:val="right"/>
+      <w:pPr>
+        <w:ind w:left="4320" w:hanging="180"/>
+      </w:pPr>
+    </w:lvl>
+    <w:lvl w:ilvl="6" w:tplc="0409000F" w:tentative="1">
+      <w:start w:val="1"/>
+      <w:numFmt w:val="decimal"/>
+      <w:lvlText w:val="%7."/>
+      <w:lvlJc w:val="left"/>
+      <w:pPr>
+        <w:ind w:left="5040" w:hanging="360"/>
+      </w:pPr>
+    </w:lvl>
+    <w:lvl w:ilvl="7" w:tplc="04090019" w:tentative="1">
+      <w:start w:val="1"/>
+      <w:numFmt w:val="lowerLetter"/>
+      <w:lvlText w:val="%8."/>
+      <w:lvlJc w:val="left"/>
+      <w:pPr>
+        <w:ind w:left="5760" w:hanging="360"/>
+      </w:pPr>
+    </w:lvl>
+    <w:lvl w:ilvl="8" w:tplc="0409001B" w:tentative="1">
+      <w:start w:val="1"/>
+      <w:numFmt w:val="lowerRoman"/>
+      <w:lvlText w:val="%9."/>
+      <w:lvlJc w:val="right"/>
+      <w:pPr>
+        <w:ind w:left="6480" w:hanging="180"/>
+      </w:pPr>
+    </w:lvl>
+  </w:abstractNum>
+  <w:abstractNum w:abstractNumId="7" w15:restartNumberingAfterBreak="0">
     <w:nsid w:val="51FE4B9C"/>
     <w:multiLevelType w:val="hybridMultilevel"/>
     <w:tmpl w:val="E7207024"/>
@@ -3738,7 +3751,7 @@
       </w:pPr>
     </w:lvl>
   </w:abstractNum>
-  <w:abstractNum w:abstractNumId="7" w15:restartNumberingAfterBreak="0">
+  <w:abstractNum w:abstractNumId="8" w15:restartNumberingAfterBreak="0">
     <w:nsid w:val="53B34E69"/>
     <w:multiLevelType w:val="hybridMultilevel"/>
     <w:tmpl w:val="1C809EBE"/>
@@ -3827,7 +3840,7 @@
       </w:pPr>
     </w:lvl>
   </w:abstractNum>
-  <w:abstractNum w:abstractNumId="8" w15:restartNumberingAfterBreak="0">
+  <w:abstractNum w:abstractNumId="9" w15:restartNumberingAfterBreak="0">
     <w:nsid w:val="54EC2D45"/>
     <w:multiLevelType w:val="hybridMultilevel"/>
     <w:tmpl w:val="D20EECAA"/>
@@ -3940,7 +3953,7 @@
       </w:rPr>
     </w:lvl>
   </w:abstractNum>
-  <w:abstractNum w:abstractNumId="9" w15:restartNumberingAfterBreak="0">
+  <w:abstractNum w:abstractNumId="10" w15:restartNumberingAfterBreak="0">
     <w:nsid w:val="5F8529DA"/>
     <w:multiLevelType w:val="hybridMultilevel"/>
     <w:tmpl w:val="AB045046"/>
@@ -4026,7 +4039,7 @@
       </w:pPr>
     </w:lvl>
   </w:abstractNum>
-  <w:abstractNum w:abstractNumId="10" w15:restartNumberingAfterBreak="0">
+  <w:abstractNum w:abstractNumId="11" w15:restartNumberingAfterBreak="0">
     <w:nsid w:val="63F45124"/>
     <w:multiLevelType w:val="hybridMultilevel"/>
     <w:tmpl w:val="3BEA0158"/>
@@ -4112,7 +4125,7 @@
       </w:pPr>
     </w:lvl>
   </w:abstractNum>
-  <w:abstractNum w:abstractNumId="11" w15:restartNumberingAfterBreak="0">
+  <w:abstractNum w:abstractNumId="12" w15:restartNumberingAfterBreak="0">
     <w:nsid w:val="6588646D"/>
     <w:multiLevelType w:val="hybridMultilevel"/>
     <w:tmpl w:val="E58E01A4"/>
@@ -4198,7 +4211,7 @@
       </w:pPr>
     </w:lvl>
   </w:abstractNum>
-  <w:abstractNum w:abstractNumId="12" w15:restartNumberingAfterBreak="0">
+  <w:abstractNum w:abstractNumId="13" w15:restartNumberingAfterBreak="0">
     <w:nsid w:val="69E951C8"/>
     <w:multiLevelType w:val="hybridMultilevel"/>
     <w:tmpl w:val="6DDE42DA"/>
@@ -4284,7 +4297,7 @@
       </w:pPr>
     </w:lvl>
   </w:abstractNum>
-  <w:abstractNum w:abstractNumId="13" w15:restartNumberingAfterBreak="0">
+  <w:abstractNum w:abstractNumId="14" w15:restartNumberingAfterBreak="0">
     <w:nsid w:val="6A016FAD"/>
     <w:multiLevelType w:val="hybridMultilevel"/>
     <w:tmpl w:val="8C2624D2"/>
@@ -4370,7 +4383,7 @@
       </w:pPr>
     </w:lvl>
   </w:abstractNum>
-  <w:abstractNum w:abstractNumId="14" w15:restartNumberingAfterBreak="0">
+  <w:abstractNum w:abstractNumId="15" w15:restartNumberingAfterBreak="0">
     <w:nsid w:val="719D68EB"/>
     <w:multiLevelType w:val="hybridMultilevel"/>
     <w:tmpl w:val="76FC1BEA"/>
@@ -4456,7 +4469,7 @@
       </w:pPr>
     </w:lvl>
   </w:abstractNum>
-  <w:abstractNum w:abstractNumId="15" w15:restartNumberingAfterBreak="0">
+  <w:abstractNum w:abstractNumId="16" w15:restartNumberingAfterBreak="0">
     <w:nsid w:val="71B2784C"/>
     <w:multiLevelType w:val="hybridMultilevel"/>
     <w:tmpl w:val="8C2624D2"/>
@@ -4542,7 +4555,7 @@
       </w:pPr>
     </w:lvl>
   </w:abstractNum>
-  <w:abstractNum w:abstractNumId="16" w15:restartNumberingAfterBreak="0">
+  <w:abstractNum w:abstractNumId="17" w15:restartNumberingAfterBreak="0">
     <w:nsid w:val="7546469B"/>
     <w:multiLevelType w:val="hybridMultilevel"/>
     <w:tmpl w:val="FD9622CA"/>
@@ -4628,7 +4641,7 @@
       </w:pPr>
     </w:lvl>
   </w:abstractNum>
-  <w:abstractNum w:abstractNumId="17" w15:restartNumberingAfterBreak="0">
+  <w:abstractNum w:abstractNumId="18" w15:restartNumberingAfterBreak="0">
     <w:nsid w:val="75DC4BB5"/>
     <w:multiLevelType w:val="hybridMultilevel"/>
     <w:tmpl w:val="32E86C58"/>
@@ -4714,7 +4727,7 @@
       </w:pPr>
     </w:lvl>
   </w:abstractNum>
-  <w:abstractNum w:abstractNumId="18" w15:restartNumberingAfterBreak="0">
+  <w:abstractNum w:abstractNumId="19" w15:restartNumberingAfterBreak="0">
     <w:nsid w:val="7EA12A5F"/>
     <w:multiLevelType w:val="hybridMultilevel"/>
     <w:tmpl w:val="7062F7F2"/>
@@ -4801,10 +4814,10 @@
     </w:lvl>
   </w:abstractNum>
   <w:num w:numId="1" w16cid:durableId="1213466093">
-    <w:abstractNumId w:val="17"/>
+    <w:abstractNumId w:val="18"/>
   </w:num>
   <w:num w:numId="2" w16cid:durableId="52973852">
-    <w:abstractNumId w:val="14"/>
+    <w:abstractNumId w:val="15"/>
   </w:num>
   <w:num w:numId="3" w16cid:durableId="1354039489">
     <w:abstractNumId w:val="0"/>
@@ -4813,22 +4826,22 @@
     <w:abstractNumId w:val="1"/>
   </w:num>
   <w:num w:numId="5" w16cid:durableId="957104568">
-    <w:abstractNumId w:val="11"/>
+    <w:abstractNumId w:val="12"/>
   </w:num>
   <w:num w:numId="6" w16cid:durableId="363869643">
-    <w:abstractNumId w:val="15"/>
+    <w:abstractNumId w:val="16"/>
   </w:num>
   <w:num w:numId="7" w16cid:durableId="455873876">
-    <w:abstractNumId w:val="18"/>
+    <w:abstractNumId w:val="19"/>
   </w:num>
   <w:num w:numId="8" w16cid:durableId="2129200870">
-    <w:abstractNumId w:val="8"/>
+    <w:abstractNumId w:val="9"/>
   </w:num>
   <w:num w:numId="9" w16cid:durableId="206258198">
-    <w:abstractNumId w:val="13"/>
+    <w:abstractNumId w:val="14"/>
   </w:num>
   <w:num w:numId="10" w16cid:durableId="202376197">
-    <w:abstractNumId w:val="12"/>
+    <w:abstractNumId w:val="13"/>
   </w:num>
   <w:num w:numId="11" w16cid:durableId="1443306037">
     <w:abstractNumId w:val="3"/>
@@ -4840,21 +4853,24 @@
     <w:abstractNumId w:val="2"/>
   </w:num>
   <w:num w:numId="14" w16cid:durableId="259916685">
+    <w:abstractNumId w:val="11"/>
+  </w:num>
+  <w:num w:numId="15" w16cid:durableId="2021154297">
     <w:abstractNumId w:val="10"/>
   </w:num>
-  <w:num w:numId="15" w16cid:durableId="2021154297">
-    <w:abstractNumId w:val="9"/>
-  </w:num>
   <w:num w:numId="16" w16cid:durableId="1571034786">
-    <w:abstractNumId w:val="16"/>
+    <w:abstractNumId w:val="17"/>
   </w:num>
   <w:num w:numId="17" w16cid:durableId="893850062">
     <w:abstractNumId w:val="5"/>
   </w:num>
   <w:num w:numId="18" w16cid:durableId="616373826">
+    <w:abstractNumId w:val="8"/>
+  </w:num>
+  <w:num w:numId="19" w16cid:durableId="771242039">
     <w:abstractNumId w:val="7"/>
   </w:num>
-  <w:num w:numId="19" w16cid:durableId="771242039">
+  <w:num w:numId="20" w16cid:durableId="351928931">
     <w:abstractNumId w:val="6"/>
   </w:num>
 </w:numbering>

</xml_diff>